<commit_message>
Unit 5's printed test (Croix, 30 Oct: 'Yeah change them'): Form A Q1, Form B Q1, Form A 6(a), Form A Q14 and Form A 17(a) no longer repeat 5.01, 5.04, the reference sheet and 5.10 Notes III; the unit rebuilt and installed; the practice page's forms list and hashes follow ('An 8 cm side'); every check passes for the page and the teacher copy. NOTES.
Co-Authored-By: Claude Fable 5.1 <noreply@anthropic.com>
Claude-Session: https://claude.ai/code/session_01B7ovt6yLjh6QuFV9HBMV4N
</commit_message>
<xml_diff>
--- a/a7/build/out/u5/A7 Unit 5 Multi-Step Proportional Relationships - Practice Test - Key.docx
+++ b/a7/build/out/u5/A7 Unit 5 Multi-Step Proportional Relationships - Practice Test - Key.docx
@@ -4274,6 +4274,7 @@
           </w:tcPr>
           <w:p>
             <w:pPr>
+              <w:keepNext/>
               <w:spacing w:after="0"/>
             </w:pPr>
             <w:r>
@@ -4305,6 +4306,7 @@
           </w:tcPr>
           <w:p>
             <w:pPr>
+              <w:keepNext/>
               <w:spacing w:after="0"/>
             </w:pPr>
             <w:r>
@@ -4336,6 +4338,7 @@
           </w:tcPr>
           <w:p>
             <w:pPr>
+              <w:keepNext/>
               <w:spacing w:after="0"/>
             </w:pPr>
             <w:r>
@@ -4367,6 +4370,7 @@
           </w:tcPr>
           <w:p>
             <w:pPr>
+              <w:keepNext/>
               <w:spacing w:after="0"/>
             </w:pPr>
           </w:p>
@@ -4394,6 +4398,7 @@
           </w:tcPr>
           <w:p>
             <w:pPr>
+              <w:keepNext/>
               <w:spacing w:after="0"/>
             </w:pPr>
             <w:r>
@@ -4425,6 +4430,7 @@
           </w:tcPr>
           <w:p>
             <w:pPr>
+              <w:keepNext/>
               <w:spacing w:after="0"/>
             </w:pPr>
             <w:r>
@@ -4456,6 +4462,7 @@
           </w:tcPr>
           <w:p>
             <w:pPr>
+              <w:keepNext/>
               <w:spacing w:after="0"/>
             </w:pPr>
             <w:r>
@@ -4487,6 +4494,7 @@
           </w:tcPr>
           <w:p>
             <w:pPr>
+              <w:keepNext/>
               <w:spacing w:after="0"/>
             </w:pPr>
           </w:p>
@@ -4514,6 +4522,7 @@
           </w:tcPr>
           <w:p>
             <w:pPr>
+              <w:keepNext/>
               <w:spacing w:after="0"/>
             </w:pPr>
             <w:r>
@@ -4545,6 +4554,7 @@
           </w:tcPr>
           <w:p>
             <w:pPr>
+              <w:keepNext/>
               <w:spacing w:after="0"/>
             </w:pPr>
             <w:r>
@@ -4576,6 +4586,7 @@
           </w:tcPr>
           <w:p>
             <w:pPr>
+              <w:keepNext/>
               <w:spacing w:after="0"/>
             </w:pPr>
             <w:r>
@@ -4607,6 +4618,7 @@
           </w:tcPr>
           <w:p>
             <w:pPr>
+              <w:keepNext/>
               <w:spacing w:after="0"/>
             </w:pPr>
           </w:p>

</xml_diff>